<commit_message>
Update penanda tangan di template: Fauzun Abduh Ginting -> Hikmat Slamet
- Tabel 0 (identitas pejabat): Nama/NIK = Hikmat Slamet / 20080624, Jabatan = Division Head of Human Capital
- Tabel 2 (kotak TTD): nama = HIKMAT SLAMET, NIK. 20080624, jabatan = Division Head of Human Capital
- Format run dipertahankan (bold)
- Tambah scripts/update_ttd.py (reusable utk edit penanda tangan)
Verified: generate -> semua cell TTD terisi benar
</commit_message>
<xml_diff>
--- a/templates_surat/template_surat.docx
+++ b/templates_surat/template_surat.docx
@@ -376,7 +376,7 @@
                 <w:sz w:val="20"/>
                 <w:szCs w:val="20"/>
               </w:rPr>
-              <w:t>Fauzun Abduh Ginting</w:t>
+              <w:t>Hikmat Slamet / 20080624</w:t>
             </w:r>
             <w:r>
               <w:rPr>
@@ -386,7 +386,6 @@
                 <w:szCs w:val="20"/>
                 <w:lang w:val="en-US"/>
               </w:rPr>
-              <w:t xml:space="preserve"> / </w:t>
             </w:r>
             <w:r>
               <w:rPr>
@@ -394,7 +393,6 @@
                 <w:sz w:val="20"/>
                 <w:szCs w:val="20"/>
               </w:rPr>
-              <w:t>20081546</w:t>
             </w:r>
           </w:p>
         </w:tc>
@@ -525,7 +523,7 @@
                 <w:szCs w:val="20"/>
                 <w:lang w:val="en-US"/>
               </w:rPr>
-              <w:t>Pgs. Division</w:t>
+              <w:t>Division Head of Human Capital</w:t>
             </w:r>
             <w:r>
               <w:rPr>
@@ -535,7 +533,6 @@
                 <w:sz w:val="20"/>
                 <w:szCs w:val="20"/>
               </w:rPr>
-              <w:t> </w:t>
             </w:r>
             <w:r>
               <w:rPr>
@@ -546,7 +543,6 @@
                 <w:szCs w:val="20"/>
                 <w:lang w:val="en-US"/>
               </w:rPr>
-              <w:t xml:space="preserve">of </w:t>
             </w:r>
             <w:r>
               <w:rPr>
@@ -556,7 +552,6 @@
                 <w:sz w:val="20"/>
                 <w:szCs w:val="20"/>
               </w:rPr>
-              <w:t>Head</w:t>
             </w:r>
             <w:r>
               <w:rPr>
@@ -567,7 +562,6 @@
                 <w:szCs w:val="20"/>
                 <w:lang w:val="en-US"/>
               </w:rPr>
-              <w:t xml:space="preserve"> Human Capital</w:t>
             </w:r>
           </w:p>
         </w:tc>
@@ -1738,7 +1732,7 @@
                 <w:szCs w:val="20"/>
                 <w:lang w:val="en-US"/>
               </w:rPr>
-              <w:t>Pgs. Division</w:t>
+              <w:t>Division Head of Human Capital</w:t>
             </w:r>
             <w:r>
               <w:rPr>
@@ -1750,7 +1744,6 @@
                 <w:sz w:val="20"/>
                 <w:szCs w:val="20"/>
               </w:rPr>
-              <w:t> Head</w:t>
             </w:r>
             <w:r>
               <w:rPr>
@@ -1763,7 +1756,6 @@
                 <w:szCs w:val="20"/>
                 <w:lang w:val="en-US"/>
               </w:rPr>
-              <w:t xml:space="preserve"> of Human Capital</w:t>
             </w:r>
             <w:r>
               <w:rPr>
@@ -1777,7 +1769,6 @@
                 <w:szCs w:val="20"/>
                 <w:lang w:val="en-US"/>
               </w:rPr>
-              <w:t xml:space="preserve"> </w:t>
             </w:r>
           </w:p>
         </w:tc>
@@ -1813,122 +1804,10 @@
                 <w:szCs w:val="20"/>
               </w:rPr>
             </w:pPr>
-          </w:p>
-          <w:p>
-            <w:pPr>
-              <w:spacing w:after="0" w:line="240" w:lineRule="auto"/>
-              <w:jc w:val="center"/>
-              <w:rPr>
-                <w:rFonts w:hint="default" w:ascii="Arial" w:hAnsi="Arial" w:eastAsia="Times New Roman" w:cs="Arial"/>
-                <w:b/>
-                <w:bCs/>
-                <w:sz w:val="20"/>
-                <w:szCs w:val="20"/>
-              </w:rPr>
-            </w:pPr>
-          </w:p>
-          <w:p>
-            <w:pPr>
-              <w:spacing w:after="0" w:line="240" w:lineRule="auto"/>
-              <w:jc w:val="center"/>
-              <w:rPr>
-                <w:rFonts w:hint="default" w:ascii="Arial" w:hAnsi="Arial" w:eastAsia="Times New Roman" w:cs="Arial"/>
-                <w:b/>
-                <w:bCs/>
-                <w:sz w:val="20"/>
-                <w:szCs w:val="20"/>
-              </w:rPr>
-            </w:pPr>
-          </w:p>
-          <w:p>
-            <w:pPr>
-              <w:spacing w:after="0" w:line="240" w:lineRule="auto"/>
-              <w:jc w:val="center"/>
-              <w:rPr>
-                <w:rFonts w:hint="default" w:ascii="Arial" w:hAnsi="Arial" w:eastAsia="Times New Roman" w:cs="Arial"/>
-                <w:b/>
-                <w:bCs/>
-                <w:sz w:val="20"/>
-                <w:szCs w:val="20"/>
-              </w:rPr>
-            </w:pPr>
-          </w:p>
-          <w:p>
-            <w:pPr>
-              <w:spacing w:after="0" w:line="240" w:lineRule="auto"/>
-              <w:jc w:val="center"/>
-              <w:rPr>
-                <w:rFonts w:hint="default" w:ascii="Arial" w:hAnsi="Arial" w:eastAsia="Arial" w:cs="Arial"/>
-                <w:b/>
-                <w:bCs/>
-                <w:i w:val="0"/>
-                <w:iCs w:val="0"/>
-                <w:color w:val="000000"/>
-                <w:sz w:val="20"/>
-                <w:szCs w:val="20"/>
-                <w:u w:val="single"/>
-                <w:lang w:val="en-US"/>
-              </w:rPr>
-            </w:pPr>
             <w:r>
-              <w:rPr>
-                <w:rFonts w:hint="default" w:ascii="Arial" w:hAnsi="Arial" w:eastAsia="Arial" w:cs="Arial"/>
-                <w:b/>
-                <w:bCs/>
-                <w:color w:val="000000"/>
-                <w:sz w:val="20"/>
-                <w:szCs w:val="20"/>
-                <w:lang w:val="en-US"/>
-              </w:rPr>
-              <w:t xml:space="preserve"> </w:t>
-            </w:r>
-            <w:r>
-              <w:rPr>
-                <w:rFonts w:hint="default" w:ascii="Arial" w:hAnsi="Arial" w:eastAsia="SimSun" w:cs="Arial"/>
-                <w:b/>
-                <w:bCs/>
-                <w:sz w:val="20"/>
-                <w:szCs w:val="20"/>
-                <w:u w:val="single"/>
-              </w:rPr>
-              <w:t>FAUZUN ABDUH GINTING</w:t>
-            </w:r>
-          </w:p>
-          <w:p>
-            <w:pPr>
-              <w:spacing w:after="0" w:line="240" w:lineRule="auto"/>
-              <w:jc w:val="center"/>
-              <w:rPr>
-                <w:rFonts w:hint="default" w:ascii="Arial" w:hAnsi="Arial" w:eastAsia="Times New Roman" w:cs="Arial"/>
-                <w:b/>
-                <w:bCs/>
-                <w:sz w:val="20"/>
-                <w:szCs w:val="20"/>
-                <w:lang w:val="en-US"/>
-              </w:rPr>
-            </w:pPr>
-            <w:r>
-              <w:rPr>
-                <w:rFonts w:hint="default" w:ascii="Arial" w:hAnsi="Arial" w:eastAsia="Times New Roman" w:cs="Arial"/>
-                <w:b/>
-                <w:bCs/>
-                <w:color w:val="auto"/>
-                <w:sz w:val="20"/>
-                <w:szCs w:val="20"/>
-                <w:u w:val="none"/>
-                <w:lang w:val="en-US"/>
-              </w:rPr>
-              <w:t xml:space="preserve">NIK. </w:t>
-            </w:r>
-            <w:r>
-              <w:rPr>
-                <w:rFonts w:hint="default" w:ascii="Arial" w:hAnsi="Arial" w:eastAsia="SimSun" w:cs="Arial"/>
-                <w:b/>
-                <w:bCs/>
-                <w:sz w:val="20"/>
-                <w:szCs w:val="20"/>
-              </w:rPr>
-              <w:t>20081546</w:t>
+              <w:t>HIKMAT SLAMET</w:t>
+              <w:br/>
+              <w:t>NIK. 20080624</w:t>
             </w:r>
           </w:p>
         </w:tc>

</xml_diff>

<commit_message>
Update: gunakan TEMPLATE BARU v2 sebagai template_surat aktif (penanda tangan Hikmat Slamet)
Template v2 sudah berisi penanda tangan Hikmat Slamet / 20080624 & jabatan Division (of) Head Human Capital.
Struktur identik (5 tabel, 36 paragraf, margin 3/2.5). Generator kompatibel tanpa perubahan.
Verified: E2E pass; generate -> p34, Tabel1, Tabel0, Tabel2 terisi benar.
</commit_message>
<xml_diff>
--- a/templates_surat/template_surat.docx
+++ b/templates_surat/template_surat.docx
@@ -292,7 +292,7 @@
             <w:pPr>
               <w:widowControl w:val="0"/>
               <w:spacing w:after="0" w:line="240" w:lineRule="auto"/>
-              <w:ind w:right="-109" w:hanging="94"/>
+              <w:ind w:right="-109" w:rightChars="0" w:hanging="94" w:firstLineChars="0"/>
               <w:jc w:val="both"/>
               <w:rPr>
                 <w:rFonts w:hint="default" w:ascii="Arial" w:hAnsi="Arial" w:cs="Arial"/>
@@ -322,7 +322,7 @@
             <w:pPr>
               <w:widowControl w:val="0"/>
               <w:spacing w:after="0" w:line="240" w:lineRule="auto"/>
-              <w:ind w:left="-109" w:right="-109" w:hanging="94"/>
+              <w:ind w:left="-109" w:leftChars="0" w:right="-109" w:rightChars="0" w:hanging="94" w:firstLineChars="0"/>
               <w:jc w:val="center"/>
               <w:rPr>
                 <w:rFonts w:hint="default" w:ascii="Arial" w:hAnsi="Arial" w:cs="Arial"/>
@@ -360,7 +360,7 @@
                 <w:between w:val="none" w:color="auto" w:sz="0" w:space="0"/>
               </w:pBdr>
               <w:spacing w:before="0" w:beforeAutospacing="0" w:after="0" w:afterAutospacing="0" w:line="240" w:lineRule="auto"/>
-              <w:ind w:left="0" w:right="0"/>
+              <w:ind w:left="0" w:leftChars="0" w:right="0" w:rightChars="0"/>
               <w:jc w:val="both"/>
               <w:rPr>
                 <w:rFonts w:hint="default" w:ascii="Arial" w:hAnsi="Arial" w:eastAsia="SimSun" w:cs="Arial"/>
@@ -372,11 +372,11 @@
             </w:pPr>
             <w:r>
               <w:rPr>
-                <w:rFonts w:hint="default" w:ascii="Arial" w:hAnsi="Arial" w:eastAsia="SimSun" w:cs="Arial"/>
+                <w:rFonts w:hint="default" w:ascii="Arial" w:hAnsi="Arial" w:eastAsia="SimSun"/>
                 <w:sz w:val="20"/>
                 <w:szCs w:val="20"/>
               </w:rPr>
-              <w:t>Hikmat Slamet / 20080624</w:t>
+              <w:t>Hikmat Slamet</w:t>
             </w:r>
             <w:r>
               <w:rPr>
@@ -386,13 +386,15 @@
                 <w:szCs w:val="20"/>
                 <w:lang w:val="en-US"/>
               </w:rPr>
+              <w:t xml:space="preserve"> / </w:t>
             </w:r>
             <w:r>
               <w:rPr>
-                <w:rFonts w:hint="default" w:ascii="Arial" w:hAnsi="Arial" w:eastAsia="SimSun" w:cs="Arial"/>
+                <w:rFonts w:hint="default" w:ascii="Arial" w:hAnsi="Arial" w:eastAsia="SimSun"/>
                 <w:sz w:val="20"/>
                 <w:szCs w:val="20"/>
               </w:rPr>
+              <w:t>20080624</w:t>
             </w:r>
           </w:p>
         </w:tc>
@@ -426,7 +428,7 @@
             <w:pPr>
               <w:widowControl w:val="0"/>
               <w:spacing w:after="0" w:line="240" w:lineRule="auto"/>
-              <w:ind w:right="-109" w:hanging="94"/>
+              <w:ind w:right="-109" w:rightChars="0" w:hanging="94" w:firstLineChars="0"/>
               <w:jc w:val="both"/>
               <w:rPr>
                 <w:rFonts w:hint="default" w:ascii="Arial" w:hAnsi="Arial" w:cs="Arial"/>
@@ -504,7 +506,7 @@
                 <w:between w:val="none" w:color="auto" w:sz="0" w:space="0"/>
               </w:pBdr>
               <w:spacing w:before="0" w:beforeAutospacing="0" w:after="0" w:afterAutospacing="0" w:line="240" w:lineRule="auto"/>
-              <w:ind w:left="0" w:right="0"/>
+              <w:ind w:left="0" w:leftChars="0" w:right="0" w:rightChars="0"/>
               <w:jc w:val="both"/>
               <w:rPr>
                 <w:rFonts w:ascii="Arial" w:hAnsi="Arial" w:eastAsia="Arial" w:cs="Arial"/>
@@ -523,7 +525,7 @@
                 <w:szCs w:val="20"/>
                 <w:lang w:val="en-US"/>
               </w:rPr>
-              <w:t>Division Head of Human Capital</w:t>
+              <w:t>Division</w:t>
             </w:r>
             <w:r>
               <w:rPr>
@@ -533,6 +535,7 @@
                 <w:sz w:val="20"/>
                 <w:szCs w:val="20"/>
               </w:rPr>
+              <w:t> </w:t>
             </w:r>
             <w:r>
               <w:rPr>
@@ -543,6 +546,7 @@
                 <w:szCs w:val="20"/>
                 <w:lang w:val="en-US"/>
               </w:rPr>
+              <w:t xml:space="preserve">of </w:t>
             </w:r>
             <w:r>
               <w:rPr>
@@ -552,6 +556,7 @@
                 <w:sz w:val="20"/>
                 <w:szCs w:val="20"/>
               </w:rPr>
+              <w:t>Head</w:t>
             </w:r>
             <w:r>
               <w:rPr>
@@ -562,6 +567,7 @@
                 <w:szCs w:val="20"/>
                 <w:lang w:val="en-US"/>
               </w:rPr>
+              <w:t xml:space="preserve"> Human Capital</w:t>
             </w:r>
           </w:p>
         </w:tc>
@@ -678,12 +684,6 @@
             <w:insideH w:val="none" w:color="auto" w:sz="0" w:space="0"/>
             <w:insideV w:val="none" w:color="auto" w:sz="0" w:space="0"/>
           </w:tblBorders>
-          <w:tblCellMar>
-            <w:top w:w="0" w:type="dxa"/>
-            <w:left w:w="108" w:type="dxa"/>
-            <w:bottom w:w="0" w:type="dxa"/>
-            <w:right w:w="108" w:type="dxa"/>
-          </w:tblCellMar>
         </w:tblPrEx>
         <w:trPr>
           <w:trHeight w:val="285" w:hRule="atLeast"/>
@@ -1550,14 +1550,6 @@
         <w:gridCol w:w="3880"/>
       </w:tblGrid>
       <w:tr>
-        <w:tblPrEx>
-          <w:tblCellMar>
-            <w:top w:w="0" w:type="dxa"/>
-            <w:left w:w="108" w:type="dxa"/>
-            <w:bottom w:w="0" w:type="dxa"/>
-            <w:right w:w="108" w:type="dxa"/>
-          </w:tblCellMar>
-        </w:tblPrEx>
         <w:trPr>
           <w:trHeight w:val="447" w:hRule="atLeast"/>
           <w:jc w:val="center"/>
@@ -1595,8 +1587,22 @@
           </w:p>
           <w:p>
             <w:pPr>
-              <w:spacing w:after="0" w:line="240" w:lineRule="auto"/>
+              <w:keepNext w:val="0"/>
+              <w:keepLines w:val="0"/>
+              <w:pageBreakBefore w:val="0"/>
+              <w:widowControl/>
+              <w:kinsoku/>
+              <w:wordWrap/>
+              <w:overflowPunct/>
+              <w:topLinePunct w:val="0"/>
+              <w:autoSpaceDE/>
+              <w:autoSpaceDN/>
+              <w:bidi w:val="0"/>
+              <w:adjustRightInd/>
+              <w:snapToGrid/>
+              <w:spacing w:after="361" w:afterLines="100" w:line="240" w:lineRule="auto"/>
               <w:jc w:val="both"/>
+              <w:textAlignment w:val="auto"/>
               <w:rPr>
                 <w:rFonts w:hint="default" w:ascii="Arial" w:hAnsi="Arial" w:eastAsia="Times New Roman" w:cs="Arial"/>
                 <w:b/>
@@ -1732,7 +1738,7 @@
                 <w:szCs w:val="20"/>
                 <w:lang w:val="en-US"/>
               </w:rPr>
-              <w:t>Division Head of Human Capital</w:t>
+              <w:t>Division</w:t>
             </w:r>
             <w:r>
               <w:rPr>
@@ -1744,6 +1750,7 @@
                 <w:sz w:val="20"/>
                 <w:szCs w:val="20"/>
               </w:rPr>
+              <w:t> Head</w:t>
             </w:r>
             <w:r>
               <w:rPr>
@@ -1756,6 +1763,7 @@
                 <w:szCs w:val="20"/>
                 <w:lang w:val="en-US"/>
               </w:rPr>
+              <w:t xml:space="preserve"> of Human Capital</w:t>
             </w:r>
             <w:r>
               <w:rPr>
@@ -1769,6 +1777,7 @@
                 <w:szCs w:val="20"/>
                 <w:lang w:val="en-US"/>
               </w:rPr>
+              <w:t xml:space="preserve"> </w:t>
             </w:r>
           </w:p>
         </w:tc>
@@ -1804,10 +1813,136 @@
                 <w:szCs w:val="20"/>
               </w:rPr>
             </w:pPr>
+          </w:p>
+          <w:p>
+            <w:pPr>
+              <w:spacing w:after="0" w:line="240" w:lineRule="auto"/>
+              <w:jc w:val="center"/>
+              <w:rPr>
+                <w:rFonts w:hint="default" w:ascii="Arial" w:hAnsi="Arial" w:eastAsia="Times New Roman" w:cs="Arial"/>
+                <w:b/>
+                <w:bCs/>
+                <w:sz w:val="20"/>
+                <w:szCs w:val="20"/>
+              </w:rPr>
+            </w:pPr>
+          </w:p>
+          <w:p>
+            <w:pPr>
+              <w:spacing w:after="0" w:line="240" w:lineRule="auto"/>
+              <w:jc w:val="center"/>
+              <w:rPr>
+                <w:rFonts w:hint="default" w:ascii="Arial" w:hAnsi="Arial" w:eastAsia="Times New Roman" w:cs="Arial"/>
+                <w:b/>
+                <w:bCs/>
+                <w:sz w:val="20"/>
+                <w:szCs w:val="20"/>
+              </w:rPr>
+            </w:pPr>
+          </w:p>
+          <w:p>
+            <w:pPr>
+              <w:spacing w:after="0" w:line="240" w:lineRule="auto"/>
+              <w:jc w:val="center"/>
+              <w:rPr>
+                <w:rFonts w:hint="default" w:ascii="Arial" w:hAnsi="Arial" w:eastAsia="Times New Roman" w:cs="Arial"/>
+                <w:b/>
+                <w:bCs/>
+                <w:sz w:val="20"/>
+                <w:szCs w:val="20"/>
+              </w:rPr>
+            </w:pPr>
+          </w:p>
+          <w:p>
+            <w:pPr>
+              <w:spacing w:after="0" w:line="240" w:lineRule="auto"/>
+              <w:jc w:val="center"/>
+              <w:rPr>
+                <w:rFonts w:hint="default" w:ascii="Arial" w:hAnsi="Arial" w:eastAsia="Arial" w:cs="Arial"/>
+                <w:b/>
+                <w:bCs/>
+                <w:i w:val="0"/>
+                <w:iCs w:val="0"/>
+                <w:color w:val="000000"/>
+                <w:sz w:val="20"/>
+                <w:szCs w:val="20"/>
+                <w:u w:val="single"/>
+                <w:lang w:val="en-US"/>
+              </w:rPr>
+            </w:pPr>
             <w:r>
+              <w:rPr>
+                <w:rFonts w:hint="default" w:ascii="Arial" w:hAnsi="Arial" w:eastAsia="Arial" w:cs="Arial"/>
+                <w:b/>
+                <w:bCs/>
+                <w:color w:val="000000"/>
+                <w:sz w:val="20"/>
+                <w:szCs w:val="20"/>
+                <w:lang w:val="en-US"/>
+              </w:rPr>
+              <w:t xml:space="preserve"> </w:t>
+            </w:r>
+            <w:r>
+              <w:rPr>
+                <w:rFonts w:hint="default" w:ascii="Arial" w:hAnsi="Arial" w:eastAsia="SimSun"/>
+                <w:b/>
+                <w:bCs/>
+                <w:sz w:val="20"/>
+                <w:szCs w:val="20"/>
+                <w:u w:val="single"/>
+              </w:rPr>
               <w:t>HIKMAT SLAMET</w:t>
-              <w:br/>
-              <w:t>NIK. 20080624</w:t>
+            </w:r>
+          </w:p>
+          <w:p>
+            <w:pPr>
+              <w:spacing w:after="0" w:line="240" w:lineRule="auto"/>
+              <w:jc w:val="center"/>
+              <w:rPr>
+                <w:rFonts w:hint="default" w:ascii="Arial" w:hAnsi="Arial" w:eastAsia="Times New Roman" w:cs="Arial"/>
+                <w:b/>
+                <w:bCs/>
+                <w:sz w:val="20"/>
+                <w:szCs w:val="20"/>
+                <w:lang w:val="en-US"/>
+              </w:rPr>
+            </w:pPr>
+            <w:r>
+              <w:rPr>
+                <w:rFonts w:hint="default" w:ascii="Arial" w:hAnsi="Arial" w:eastAsia="Times New Roman" w:cs="Arial"/>
+                <w:b/>
+                <w:bCs/>
+                <w:color w:val="auto"/>
+                <w:sz w:val="20"/>
+                <w:szCs w:val="20"/>
+                <w:u w:val="none"/>
+                <w:lang w:val="en-US"/>
+              </w:rPr>
+              <w:t>NIK.</w:t>
+            </w:r>
+            <w:r>
+              <w:rPr>
+                <w:rFonts w:hint="default" w:ascii="Arial" w:hAnsi="Arial" w:eastAsia="Times New Roman" w:cs="Arial"/>
+                <w:b/>
+                <w:bCs/>
+                <w:color w:val="auto"/>
+                <w:sz w:val="20"/>
+                <w:szCs w:val="20"/>
+                <w:u w:val="none"/>
+                <w:lang w:val="id-ID"/>
+              </w:rPr>
+              <w:t xml:space="preserve"> </w:t>
+            </w:r>
+            <w:r>
+              <w:rPr>
+                <w:rFonts w:hint="default" w:ascii="Arial" w:hAnsi="Arial" w:eastAsia="SimSun"/>
+                <w:b/>
+                <w:bCs/>
+                <w:sz w:val="20"/>
+                <w:szCs w:val="20"/>
+                <w:u w:val="none"/>
+              </w:rPr>
+              <w:t>20080624</w:t>
             </w:r>
           </w:p>
         </w:tc>
@@ -2418,6 +2553,12 @@
             <w:insideH w:val="none" w:color="auto" w:sz="0" w:space="0"/>
             <w:insideV w:val="none" w:color="auto" w:sz="0" w:space="0"/>
           </w:tblBorders>
+          <w:tblCellMar>
+            <w:top w:w="0" w:type="dxa"/>
+            <w:left w:w="108" w:type="dxa"/>
+            <w:bottom w:w="0" w:type="dxa"/>
+            <w:right w:w="108" w:type="dxa"/>
+          </w:tblCellMar>
         </w:tblPrEx>
         <w:trPr>
           <w:trHeight w:val="90" w:hRule="atLeast"/>
@@ -10983,8 +11124,6 @@
           <w:lang w:val="id-ID"/>
         </w:rPr>
       </w:pPr>
-      <w:bookmarkStart w:id="0" w:name="_GoBack"/>
-      <w:bookmarkEnd w:id="0"/>
     </w:p>
     <w:sectPr>
       <w:headerReference r:id="rId5" w:type="default"/>

</xml_diff>

<commit_message>
Update footer surat: ikuti TEMPLATE BARU (www.timah.com) — ganti footer gambar lama
Footer template aktif diganti dari gambar (image) menjadi konten footer template baru v3
(garis + teks www.timah.com). Body/margin/tabel tidak berubah (5 tabel, margin 3/2.5).
Tambah scripts/copy_footer.py utk reuse. Verified: generate -> footer www.timah.com; E2E pass.
</commit_message>
<xml_diff>
--- a/templates_surat/template_surat.docx
+++ b/templates_surat/template_surat.docx
@@ -11175,54 +11175,364 @@
     </w:pPr>
     <w:r>
       <w:rPr>
-        <w:rFonts w:hint="default"/>
-        <w:lang w:val="id-ID"/>
-      </w:rPr>
-      <w:drawing>
-        <wp:anchor distT="0" distB="0" distL="114300" distR="114300" simplePos="0" relativeHeight="251659264" behindDoc="1" locked="0" layoutInCell="1" allowOverlap="1">
-          <wp:simplePos x="0" y="0"/>
-          <wp:positionH relativeFrom="column">
-            <wp:posOffset>-1091565</wp:posOffset>
-          </wp:positionH>
-          <wp:positionV relativeFrom="paragraph">
-            <wp:posOffset>203200</wp:posOffset>
-          </wp:positionV>
-          <wp:extent cx="7595235" cy="506095"/>
-          <wp:effectExtent l="0" t="0" r="9525" b="12065"/>
-          <wp:wrapNone/>
-          <wp:docPr id="3" name="Picture 3" descr="footer surat internal timah"/>
-          <wp:cNvGraphicFramePr>
-            <a:graphicFrameLocks xmlns:a="http://schemas.openxmlformats.org/drawingml/2006/main" noChangeAspect="1"/>
-          </wp:cNvGraphicFramePr>
-          <a:graphic xmlns:a="http://schemas.openxmlformats.org/drawingml/2006/main">
-            <a:graphicData uri="http://schemas.openxmlformats.org/drawingml/2006/picture">
-              <pic:pic xmlns:pic="http://schemas.openxmlformats.org/drawingml/2006/picture">
-                <pic:nvPicPr>
-                  <pic:cNvPr id="3" name="Picture 3" descr="footer surat internal timah"/>
-                  <pic:cNvPicPr>
-                    <a:picLocks noChangeAspect="1"/>
-                  </pic:cNvPicPr>
-                </pic:nvPicPr>
-                <pic:blipFill>
-                  <a:blip r:embed="rId1"/>
-                  <a:stretch>
-                    <a:fillRect/>
-                  </a:stretch>
-                </pic:blipFill>
-                <pic:spPr>
-                  <a:xfrm>
-                    <a:off x="0" y="0"/>
-                    <a:ext cx="7595235" cy="506095"/>
-                  </a:xfrm>
-                  <a:prstGeom prst="rect">
-                    <a:avLst/>
-                  </a:prstGeom>
-                </pic:spPr>
-              </pic:pic>
-            </a:graphicData>
-          </a:graphic>
-        </wp:anchor>
-      </w:drawing>
+        <w:sz w:val="18"/>
+      </w:rPr>
+      <mc:AlternateContent>
+        <mc:Choice Requires="wpg">
+          <w:drawing>
+            <wp:anchor distT="0" distB="0" distL="114300" distR="114300" simplePos="0" relativeHeight="251660288" behindDoc="0" locked="0" layoutInCell="1" allowOverlap="1">
+              <wp:simplePos x="0" y="0"/>
+              <wp:positionH relativeFrom="column">
+                <wp:posOffset>-3310255</wp:posOffset>
+              </wp:positionH>
+              <wp:positionV relativeFrom="paragraph">
+                <wp:posOffset>134620</wp:posOffset>
+              </wp:positionV>
+              <wp:extent cx="9791700" cy="529590"/>
+              <wp:effectExtent l="0" t="0" r="7620" b="1905"/>
+              <wp:wrapNone/>
+              <wp:docPr id="11" name="Group 11"/>
+              <wp:cNvGraphicFramePr/>
+              <a:graphic xmlns:a="http://schemas.openxmlformats.org/drawingml/2006/main">
+                <a:graphicData uri="http://schemas.microsoft.com/office/word/2010/wordprocessingGroup">
+                  <wpg:wgp>
+                    <wpg:cNvGrpSpPr/>
+                    <wpg:grpSpPr>
+                      <a:xfrm>
+                        <a:off x="0" y="0"/>
+                        <a:ext cx="9791700" cy="529590"/>
+                        <a:chOff x="3" y="16175"/>
+                        <a:chExt cx="15420" cy="834"/>
+                      </a:xfrm>
+                    </wpg:grpSpPr>
+                    <wps:wsp>
+                      <wps:cNvPr id="1" name="Freeform 1"/>
+                      <wps:cNvSpPr/>
+                      <wps:spPr>
+                        <a:xfrm>
+                          <a:off x="7545" y="16751"/>
+                          <a:ext cx="7879" cy="259"/>
+                        </a:xfrm>
+                        <a:custGeom>
+                          <a:avLst/>
+                          <a:gdLst>
+                            <a:gd name="connsiteX0" fmla="*/ 302 w 7748"/>
+                            <a:gd name="connsiteY0" fmla="*/ 6 h 268"/>
+                            <a:gd name="connsiteX1" fmla="*/ 7748 w 7748"/>
+                            <a:gd name="connsiteY1" fmla="*/ 0 h 268"/>
+                            <a:gd name="connsiteX2" fmla="*/ 7748 w 7748"/>
+                            <a:gd name="connsiteY2" fmla="*/ 268 h 268"/>
+                            <a:gd name="connsiteX3" fmla="*/ 0 w 7748"/>
+                            <a:gd name="connsiteY3" fmla="*/ 268 h 268"/>
+                            <a:gd name="connsiteX4" fmla="*/ 302 w 7748"/>
+                            <a:gd name="connsiteY4" fmla="*/ 6 h 268"/>
+                          </a:gdLst>
+                          <a:ahLst/>
+                          <a:cxnLst>
+                            <a:cxn ang="0">
+                              <a:pos x="connsiteX0" y="connsiteY0"/>
+                            </a:cxn>
+                            <a:cxn ang="0">
+                              <a:pos x="connsiteX1" y="connsiteY1"/>
+                            </a:cxn>
+                            <a:cxn ang="0">
+                              <a:pos x="connsiteX2" y="connsiteY2"/>
+                            </a:cxn>
+                            <a:cxn ang="0">
+                              <a:pos x="connsiteX3" y="connsiteY3"/>
+                            </a:cxn>
+                            <a:cxn ang="0">
+                              <a:pos x="connsiteX4" y="connsiteY4"/>
+                            </a:cxn>
+                          </a:cxnLst>
+                          <a:rect l="l" t="t" r="r" b="b"/>
+                          <a:pathLst>
+                            <a:path w="7748" h="268">
+                              <a:moveTo>
+                                <a:pt x="302" y="6"/>
+                              </a:moveTo>
+                              <a:lnTo>
+                                <a:pt x="7748" y="0"/>
+                              </a:lnTo>
+                              <a:lnTo>
+                                <a:pt x="7748" y="268"/>
+                              </a:lnTo>
+                              <a:lnTo>
+                                <a:pt x="0" y="268"/>
+                              </a:lnTo>
+                              <a:lnTo>
+                                <a:pt x="302" y="6"/>
+                              </a:lnTo>
+                              <a:close/>
+                            </a:path>
+                          </a:pathLst>
+                        </a:custGeom>
+                        <a:solidFill>
+                          <a:srgbClr val="3D5C74"/>
+                        </a:solidFill>
+                        <a:ln>
+                          <a:noFill/>
+                        </a:ln>
+                      </wps:spPr>
+                      <wps:style>
+                        <a:lnRef idx="2">
+                          <a:schemeClr val="accent1">
+                            <a:lumMod val="75000"/>
+                          </a:schemeClr>
+                        </a:lnRef>
+                        <a:fillRef idx="1">
+                          <a:schemeClr val="accent1"/>
+                        </a:fillRef>
+                        <a:effectRef idx="0">
+                          <a:srgbClr val="FFFFFF"/>
+                        </a:effectRef>
+                        <a:fontRef idx="minor">
+                          <a:schemeClr val="lt1"/>
+                        </a:fontRef>
+                      </wps:style>
+                      <wps:bodyPr rot="0" spcFirstLastPara="0" vertOverflow="overflow" horzOverflow="overflow" vert="horz" wrap="square" lIns="91440" tIns="45720" rIns="91440" bIns="45720" numCol="1" spcCol="0" rtlCol="0" fromWordArt="0" anchor="ctr" anchorCtr="0" forceAA="0" compatLnSpc="1">
+                        <a:noAutofit/>
+                      </wps:bodyPr>
+                    </wps:wsp>
+                    <wps:wsp>
+                      <wps:cNvPr id="5" name="Freeform 5"/>
+                      <wps:cNvSpPr/>
+                      <wps:spPr>
+                        <a:xfrm rot="10800000">
+                          <a:off x="3" y="16741"/>
+                          <a:ext cx="7754" cy="259"/>
+                        </a:xfrm>
+                        <a:custGeom>
+                          <a:avLst/>
+                          <a:gdLst>
+                            <a:gd name="connsiteX0" fmla="*/ 308 w 7754"/>
+                            <a:gd name="connsiteY0" fmla="*/ 6 h 259"/>
+                            <a:gd name="connsiteX1" fmla="*/ 7754 w 7754"/>
+                            <a:gd name="connsiteY1" fmla="*/ 0 h 259"/>
+                            <a:gd name="connsiteX2" fmla="*/ 7754 w 7754"/>
+                            <a:gd name="connsiteY2" fmla="*/ 259 h 259"/>
+                            <a:gd name="connsiteX3" fmla="*/ 0 w 7754"/>
+                            <a:gd name="connsiteY3" fmla="*/ 255 h 259"/>
+                            <a:gd name="connsiteX4" fmla="*/ 308 w 7754"/>
+                            <a:gd name="connsiteY4" fmla="*/ 6 h 259"/>
+                          </a:gdLst>
+                          <a:ahLst/>
+                          <a:cxnLst>
+                            <a:cxn ang="0">
+                              <a:pos x="connsiteX0" y="connsiteY0"/>
+                            </a:cxn>
+                            <a:cxn ang="0">
+                              <a:pos x="connsiteX1" y="connsiteY1"/>
+                            </a:cxn>
+                            <a:cxn ang="0">
+                              <a:pos x="connsiteX2" y="connsiteY2"/>
+                            </a:cxn>
+                            <a:cxn ang="0">
+                              <a:pos x="connsiteX3" y="connsiteY3"/>
+                            </a:cxn>
+                            <a:cxn ang="0">
+                              <a:pos x="connsiteX4" y="connsiteY4"/>
+                            </a:cxn>
+                          </a:cxnLst>
+                          <a:rect l="l" t="t" r="r" b="b"/>
+                          <a:pathLst>
+                            <a:path w="7754" h="259">
+                              <a:moveTo>
+                                <a:pt x="308" y="6"/>
+                              </a:moveTo>
+                              <a:lnTo>
+                                <a:pt x="7754" y="0"/>
+                              </a:lnTo>
+                              <a:lnTo>
+                                <a:pt x="7754" y="259"/>
+                              </a:lnTo>
+                              <a:lnTo>
+                                <a:pt x="0" y="255"/>
+                              </a:lnTo>
+                              <a:lnTo>
+                                <a:pt x="308" y="6"/>
+                              </a:lnTo>
+                              <a:close/>
+                            </a:path>
+                          </a:pathLst>
+                        </a:custGeom>
+                        <a:solidFill>
+                          <a:schemeClr val="accent1">
+                            <a:lumMod val="40000"/>
+                            <a:lumOff val="60000"/>
+                          </a:schemeClr>
+                        </a:solidFill>
+                        <a:ln>
+                          <a:noFill/>
+                        </a:ln>
+                      </wps:spPr>
+                      <wps:style>
+                        <a:lnRef idx="2">
+                          <a:schemeClr val="accent1">
+                            <a:lumMod val="75000"/>
+                          </a:schemeClr>
+                        </a:lnRef>
+                        <a:fillRef idx="1">
+                          <a:schemeClr val="accent1"/>
+                        </a:fillRef>
+                        <a:effectRef idx="0">
+                          <a:srgbClr val="FFFFFF"/>
+                        </a:effectRef>
+                        <a:fontRef idx="minor">
+                          <a:schemeClr val="lt1"/>
+                        </a:fontRef>
+                      </wps:style>
+                      <wps:bodyPr rot="0" spcFirstLastPara="0" vertOverflow="overflow" horzOverflow="overflow" vert="horz" wrap="square" lIns="91440" tIns="45720" rIns="91440" bIns="45720" numCol="1" spcCol="0" rtlCol="0" fromWordArt="0" anchor="ctr" anchorCtr="0" forceAA="0" compatLnSpc="1">
+                        <a:noAutofit/>
+                      </wps:bodyPr>
+                    </wps:wsp>
+                    <wps:wsp>
+                      <wps:cNvPr id="10" name="Text Box 10"/>
+                      <wps:cNvSpPr txBox="1"/>
+                      <wps:spPr>
+                        <a:xfrm>
+                          <a:off x="5200" y="16175"/>
+                          <a:ext cx="2587" cy="443"/>
+                        </a:xfrm>
+                        <a:prstGeom prst="rect">
+                          <a:avLst/>
+                        </a:prstGeom>
+                        <a:noFill/>
+                        <a:ln w="6350">
+                          <a:noFill/>
+                        </a:ln>
+                        <a:extLst>
+                          <a:ext uri="{909E8E84-426E-40DD-AFC4-6F175D3DCCD1}">
+                            <a14:hiddenFill xmlns:a14="http://schemas.microsoft.com/office/drawing/2010/main">
+                              <a:solidFill>
+                                <a:schemeClr val="lt1"/>
+                              </a:solidFill>
+                            </a14:hiddenFill>
+                          </a:ext>
+                        </a:extLst>
+                      </wps:spPr>
+                      <wps:style>
+                        <a:lnRef idx="0">
+                          <a:schemeClr val="accent1"/>
+                        </a:lnRef>
+                        <a:fillRef idx="0">
+                          <a:schemeClr val="accent1"/>
+                        </a:fillRef>
+                        <a:effectRef idx="0">
+                          <a:schemeClr val="accent1"/>
+                        </a:effectRef>
+                        <a:fontRef idx="minor">
+                          <a:schemeClr val="dk1"/>
+                        </a:fontRef>
+                      </wps:style>
+                      <wps:txbx>
+                        <w:txbxContent>
+                          <w:p>
+                            <w:pPr>
+                              <w:rPr>
+                                <w:rFonts w:hint="default" w:ascii="Arial" w:hAnsi="Arial" w:cs="Arial"/>
+                                <w:b/>
+                                <w:bCs/>
+                                <w:color w:val="3D5C74"/>
+                                <w:sz w:val="24"/>
+                                <w:szCs w:val="24"/>
+                                <w:lang w:val="id-ID"/>
+                                <w14:textOutline w14:w="9525">
+                                  <w14:round/>
+                                </w14:textOutline>
+                              </w:rPr>
+                            </w:pPr>
+                            <w:r>
+                              <w:rPr>
+                                <w:rFonts w:hint="default" w:ascii="Arial" w:hAnsi="Arial" w:cs="Arial"/>
+                                <w:b/>
+                                <w:bCs/>
+                                <w:color w:val="3D5C74"/>
+                                <w:sz w:val="24"/>
+                                <w:szCs w:val="24"/>
+                                <w:lang w:val="id-ID"/>
+                                <w14:textOutline w14:w="9525">
+                                  <w14:round/>
+                                </w14:textOutline>
+                              </w:rPr>
+                              <w:t>www.timah.com</w:t>
+                            </w:r>
+                          </w:p>
+                        </w:txbxContent>
+                      </wps:txbx>
+                      <wps:bodyPr rot="0" spcFirstLastPara="0" vertOverflow="overflow" horzOverflow="overflow" vert="horz" wrap="square" lIns="91440" tIns="45720" rIns="91440" bIns="45720" numCol="1" spcCol="0" rtlCol="0" fromWordArt="0" anchor="t" anchorCtr="0" forceAA="0" compatLnSpc="1">
+                        <a:noAutofit/>
+                      </wps:bodyPr>
+                    </wps:wsp>
+                  </wpg:wgp>
+                </a:graphicData>
+              </a:graphic>
+            </wp:anchor>
+          </w:drawing>
+        </mc:Choice>
+        <mc:Fallback>
+          <w:pict>
+            <v:group id="_x0000_s1026" o:spid="_x0000_s1026" o:spt="203" style="position:absolute;left:0pt;margin-left:-260.65pt;margin-top:10.6pt;height:41.7pt;width:771pt;z-index:251660288;mso-width-relative:page;mso-height-relative:page;" coordorigin="3,16175" coordsize="15420,834" o:gfxdata="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">
+              <o:lock v:ext="edit" aspectratio="f"/>
+              <v:shape id="_x0000_s1026" o:spid="_x0000_s1026" o:spt="100" style="position:absolute;left:7545;top:16751;height:259;width:7879;v-text-anchor:middle;" fillcolor="#3D5C74" filled="t" stroked="f" coordsize="7748,268" o:gfxdata="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" path="m302,6l7748,0,7748,268,0,268,302,6xe">
+                <v:path o:connectlocs="307,5;7879,0;7879,259;0,259;307,5" o:connectangles="0,0,0,0,0"/>
+                <v:fill on="t" focussize="0,0"/>
+                <v:stroke on="f" weight="1pt" miterlimit="8" joinstyle="miter"/>
+                <v:imagedata o:title=""/>
+                <o:lock v:ext="edit" aspectratio="f"/>
+              </v:shape>
+              <v:shape id="_x0000_s1026" o:spid="_x0000_s1026" o:spt="100" style="position:absolute;left:3;top:16741;height:259;width:7754;rotation:11796480f;v-text-anchor:middle;" fillcolor="#BDD7EE [1300]" filled="t" stroked="f" coordsize="7754,259" o:gfxdata="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" path="m308,6l7754,0,7754,259,0,255,308,6xe">
+                <v:path o:connectlocs="308,6;7754,0;7754,259;0,255;308,6" o:connectangles="0,0,0,0,0"/>
+                <v:fill on="t" focussize="0,0"/>
+                <v:stroke on="f" weight="1pt" miterlimit="8" joinstyle="miter"/>
+                <v:imagedata o:title=""/>
+                <o:lock v:ext="edit" aspectratio="f"/>
+              </v:shape>
+              <v:shape id="_x0000_s1026" o:spid="_x0000_s1026" o:spt="202" type="#_x0000_t202" style="position:absolute;left:5200;top:16175;height:443;width:2587;" filled="f" stroked="f" coordsize="21600,21600" o:gfxdata="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">
+                <v:fill on="f" focussize="0,0"/>
+                <v:stroke on="f" weight="0.5pt"/>
+                <v:imagedata o:title=""/>
+                <o:lock v:ext="edit" aspectratio="f"/>
+                <v:textbox>
+                  <w:txbxContent>
+                    <w:p>
+                      <w:pPr>
+                        <w:rPr>
+                          <w:rFonts w:hint="default" w:ascii="Arial" w:hAnsi="Arial" w:cs="Arial"/>
+                          <w:b/>
+                          <w:bCs/>
+                          <w:color w:val="3D5C74"/>
+                          <w:sz w:val="24"/>
+                          <w:szCs w:val="24"/>
+                          <w:lang w:val="id-ID"/>
+                          <w14:textOutline w14:w="9525">
+                            <w14:round/>
+                          </w14:textOutline>
+                        </w:rPr>
+                      </w:pPr>
+                      <w:r>
+                        <w:rPr>
+                          <w:rFonts w:hint="default" w:ascii="Arial" w:hAnsi="Arial" w:cs="Arial"/>
+                          <w:b/>
+                          <w:bCs/>
+                          <w:color w:val="3D5C74"/>
+                          <w:sz w:val="24"/>
+                          <w:szCs w:val="24"/>
+                          <w:lang w:val="id-ID"/>
+                          <w14:textOutline w14:w="9525">
+                            <w14:round/>
+                          </w14:textOutline>
+                        </w:rPr>
+                        <w:t>www.timah.com</w:t>
+                      </w:r>
+                    </w:p>
+                  </w:txbxContent>
+                </v:textbox>
+              </v:shape>
+            </v:group>
+          </w:pict>
+        </mc:Fallback>
+      </mc:AlternateContent>
     </w:r>
   </w:p>
 </w:ftr>

</xml_diff>